<commit_message>
updated docs with key decision like delaying plain integration
</commit_message>
<xml_diff>
--- a/docs/discovery-brief.docx
+++ b/docs/discovery-brief.docx
@@ -3402,7 +3402,7 @@
                 <w:bCs w:val="false"/>
                 <w:color w:val="000000"/>
               </w:rPr>
-              <w:t xml:space="preserve">Connectivity</w:t>
+              <w:t xml:space="preserve">Connectivity (Phase 1)</w:t>
             </w:r>
           </w:p>
         </w:tc>
@@ -3430,7 +3430,65 @@
                 <w:bCs w:val="false"/>
                 <w:color w:val="000000"/>
               </w:rPr>
-              <w:t xml:space="preserve">Launch on Plaid (third-party aggregator; no stored bank credentials) + manual/CSV import</w:t>
+              <w:t xml:space="preserve">Document/statement upload + manual entry only (limited-user test); no live aggregation</w:t>
+            </w:r>
+          </w:p>
+        </w:tc>
+      </w:tr>
+      <w:tr>
+        <w:tc>
+          <w:tcPr>
+            <w:tcW w:type="dxa" w:w="3000"/>
+            <w:tcBorders>
+              <w:top w:val="single" w:color="CCCCCC" w:sz="1"/>
+              <w:left w:val="single" w:color="CCCCCC" w:sz="1"/>
+              <w:bottom w:val="single" w:color="CCCCCC" w:sz="1"/>
+              <w:right w:val="single" w:color="CCCCCC" w:sz="1"/>
+            </w:tcBorders>
+            <w:shd w:fill="FFFFFF" w:val="clear"/>
+            <w:tcMar>
+              <w:top w:type="dxa" w:w="80"/>
+              <w:left w:type="dxa" w:w="120"/>
+              <w:bottom w:type="dxa" w:w="80"/>
+              <w:right w:type="dxa" w:w="120"/>
+            </w:tcMar>
+          </w:tcPr>
+          <w:p>
+            <w:r>
+              <w:rPr>
+                <w:b w:val="false"/>
+                <w:bCs w:val="false"/>
+                <w:color w:val="000000"/>
+              </w:rPr>
+              <w:t xml:space="preserve">Connectivity (Phase 2)</w:t>
+            </w:r>
+          </w:p>
+        </w:tc>
+        <w:tc>
+          <w:tcPr>
+            <w:tcW w:type="dxa" w:w="6360"/>
+            <w:tcBorders>
+              <w:top w:val="single" w:color="CCCCCC" w:sz="1"/>
+              <w:left w:val="single" w:color="CCCCCC" w:sz="1"/>
+              <w:bottom w:val="single" w:color="CCCCCC" w:sz="1"/>
+              <w:right w:val="single" w:color="CCCCCC" w:sz="1"/>
+            </w:tcBorders>
+            <w:shd w:fill="FFFFFF" w:val="clear"/>
+            <w:tcMar>
+              <w:top w:type="dxa" w:w="80"/>
+              <w:left w:type="dxa" w:w="120"/>
+              <w:bottom w:type="dxa" w:w="80"/>
+              <w:right w:type="dxa" w:w="120"/>
+            </w:tcMar>
+          </w:tcPr>
+          <w:p>
+            <w:r>
+              <w:rPr>
+                <w:b w:val="false"/>
+                <w:bCs w:val="false"/>
+                <w:color w:val="000000"/>
+              </w:rPr>
+              <w:t xml:space="preserve">Plaid live aggregation (no stored bank credentials)</w:t>
             </w:r>
           </w:p>
         </w:tc>

</xml_diff>